<commit_message>
docs: expand staff app section in run/deploy guide
Mục 6.3 giờ liệt kê đầy đủ tính năng hiện có của mobile-staff (các
nhóm CRUD trong tab Quản lý: tòa nhà, tiện ích, công cụ) thay vì mô tả
cũ từ lúc app mới chỉ có Tổng quan/Yêu cầu/SOS/Duyệt.

Co-Authored-By: Claude Sonnet 5 <noreply@anthropic.com>
</commit_message>
<xml_diff>
--- a/docs/HUONG_DAN_CHAY_VA_TRIEN_KHAI.docx
+++ b/docs/HUONG_DAN_CHAY_VA_TRIEN_KHAI.docx
@@ -33,12 +33,11 @@
         <w:jc w:val="center"/>
       </w:pPr>
       <w:r>
-        <w:rPr>
-          <w:i/>
-        </w:rPr>
         <w:t>Áp dụng cho máy dev Windows 11 + Docker Desktop (WSL2)</w:t>
         <w:br/>
-        <w:t>Cập nhật: 13/10/2026</w:t>
+      </w:r>
+      <w:r>
+        <w:t>Cập nhật: 15/10/2026</w:t>
       </w:r>
     </w:p>
     <w:p>
@@ -1779,13 +1778,52 @@
       <w:r>
         <w:rPr>
           <w:rFonts w:ascii="Consolas" w:hAnsi="Consolas"/>
-          <w:color w:val="B03060"/>
-          <w:sz w:val="20"/>
+          <w:sz w:val="19"/>
         </w:rPr>
         <w:t>mobile-staff/</w:t>
       </w:r>
       <w:r>
-        <w:t>), đăng nhập bằng tài khoản web quản lý, menu tự ẩn / hiện theo quyền của vai trò. Chức năng: Tổng quan, Yêu cầu hỗ trợ (nhận việc, đổi trạng thái, bình luận kèm ảnh), SOS (tự cập nhật 15 giây, rung khi có mới), Duyệt (tiện ích, kê khai, đơn dịch vụ), Ghi chỉ số điện nước theo tầng, Tra cứu cư dân / căn hộ / xe, Thông báo.</w:t>
+        <w:t>), đăng nhập bằng tài khoản web quản lý (cùng hệ thống phân quyền). Toàn bộ giao diện viết native (Expo/React Native, không WebView) để dùng mượt song song với web BQL; menu tự ẩn/hiện theo quyền của vai trò đăng nhập. Có 6 tab chính: Tổng quan, Yêu cầu, SOS, Duyệt, Quản lý, Thêm.</w:t>
+      </w:r>
+    </w:p>
+    <w:p>
+      <w:pPr>
+        <w:pStyle w:val="ListBullet"/>
+      </w:pPr>
+      <w:r>
+        <w:t>Tổng quan / Yêu cầu / SOS / Duyệt: bảng điều khiển; danh sách yêu cầu hỗ trợ (lọc / nhận việc / giao việc / đổi trạng thái / bình luận nội bộ-công khai kèm ảnh); cảnh báo SOS (tự cập nhật 15 giây, rung khi có cảnh báo mới); duyệt đăng ký tiện ích, kê khai từ cư dân, đơn dịch vụ.</w:t>
+      </w:r>
+    </w:p>
+    <w:p>
+      <w:pPr>
+        <w:pStyle w:val="ListBullet"/>
+      </w:pPr>
+      <w:r>
+        <w:t>Tab Quản lý — nhóm Quản lý tòa nhà: Tòa nhà, Căn hộ, Hạng mục căn hộ (xe), Cư dân, Kê khai từ cư dân, Voucher, Thẻ từ, Nhắc nhở, Khảo sát ý kiến — đầy đủ thêm / sửa / xoá như bản web.</w:t>
+      </w:r>
+    </w:p>
+    <w:p>
+      <w:pPr>
+        <w:pStyle w:val="ListBullet"/>
+      </w:pPr>
+      <w:r>
+        <w:t>Tab Quản lý — nhóm Quản lý tiện ích: Đăng ký tiện ích (tạo thủ công + duyệt), Danh mục tiện ích (kèm cấu hình khung giờ / giá theo ngày-giờ / lịch bảo trì), Dịch vụ, Loại dịch vụ, Đơn dịch vụ (báo giá trực tiếp), Lịch sử giao dịch, Báo cáo tiện ích (biểu đồ lấp đầy, doanh thu, xuất Excel).</w:t>
+      </w:r>
+    </w:p>
+    <w:p>
+      <w:pPr>
+        <w:pStyle w:val="ListBullet"/>
+      </w:pPr>
+      <w:r>
+        <w:t>Tab Quản lý — mục Công cụ: Ghi chỉ số điện nước theo tầng, Tra cứu cư dân / căn hộ / xe. Tab Thêm: hồ sơ, đổi mật khẩu, đăng xuất.</w:t>
+      </w:r>
+    </w:p>
+    <w:p>
+      <w:pPr>
+        <w:pStyle w:val="ListBullet"/>
+      </w:pPr>
+      <w:r>
+        <w:t>Đang hoàn thiện (dùng web cho các phần này): Danh mục yêu cầu, Tài liệu / Danh mục tài liệu, mục Tài chính (thông báo phí, đơn giá, thanh toán) và mục Cài đặt (người dùng, vai trò, cấu hình chung).</w:t>
       </w:r>
     </w:p>
     <w:p>
@@ -1801,81 +1839,34 @@
         </w:rPr>
         <w:t>cd D:\BiHome\mobile-staff</w:t>
         <w:br/>
+        <w:t>npm install</w:t>
+        <w:br/>
+        <w:t>npm run web         # mở http://localhost:8082</w:t>
+      </w:r>
+    </w:p>
+    <w:p>
+      <w:r>
+        <w:t xml:space="preserve">Đăng nhập admin / Admin@123 (hoặc tài khoản nhân viên có vai trò phù hợp). Trên điện thoại: </w:t>
       </w:r>
       <w:r>
         <w:rPr>
           <w:rFonts w:ascii="Consolas" w:hAnsi="Consolas"/>
           <w:sz w:val="19"/>
         </w:rPr>
-        <w:t>npm install</w:t>
-        <w:br/>
+        <w:t>npx expo start</w:t>
+      </w:r>
+      <w:r>
+        <w:t xml:space="preserve"> trong </w:t>
       </w:r>
       <w:r>
         <w:rPr>
           <w:rFonts w:ascii="Consolas" w:hAnsi="Consolas"/>
           <w:sz w:val="19"/>
         </w:rPr>
-        <w:t>npm run web         # mở http://localhost:8082</w:t>
-      </w:r>
-    </w:p>
-    <w:p>
-      <w:r>
-        <w:t xml:space="preserve">Đăng nhập </w:t>
-      </w:r>
-      <w:r>
-        <w:rPr>
-          <w:rFonts w:ascii="Consolas" w:hAnsi="Consolas"/>
-          <w:color w:val="B03060"/>
-          <w:sz w:val="20"/>
-        </w:rPr>
-        <w:t>admin</w:t>
-      </w:r>
-      <w:r>
-        <w:t xml:space="preserve"> / </w:t>
-      </w:r>
-      <w:r>
-        <w:rPr>
-          <w:rFonts w:ascii="Consolas" w:hAnsi="Consolas"/>
-          <w:color w:val="B03060"/>
-          <w:sz w:val="20"/>
-        </w:rPr>
-        <w:t>Admin@123</w:t>
-      </w:r>
-      <w:r>
-        <w:t xml:space="preserve">. Trên điện thoại: </w:t>
-      </w:r>
-      <w:r>
-        <w:rPr>
-          <w:rFonts w:ascii="Consolas" w:hAnsi="Consolas"/>
-          <w:color w:val="B03060"/>
-          <w:sz w:val="20"/>
-        </w:rPr>
-        <w:t>npx expo start</w:t>
-      </w:r>
-      <w:r>
-        <w:t xml:space="preserve"> trong </w:t>
-      </w:r>
-      <w:r>
-        <w:rPr>
-          <w:rFonts w:ascii="Consolas" w:hAnsi="Consolas"/>
-          <w:color w:val="B03060"/>
-          <w:sz w:val="20"/>
-        </w:rPr>
         <w:t>mobile-staff/</w:t>
       </w:r>
       <w:r>
-        <w:t xml:space="preserve"> rồi quét QR bằng Expo Go. Backend phải cho phép origin </w:t>
-      </w:r>
-      <w:r>
-        <w:rPr>
-          <w:rFonts w:ascii="Consolas" w:hAnsi="Consolas"/>
-          <w:color w:val="B03060"/>
-          <w:sz w:val="20"/>
-        </w:rPr>
-        <w:t>http://localhost:8082</w:t>
-      </w:r>
-      <w:r>
-        <w:t xml:space="preserve"> (đã có trong cấu hình local).</w:t>
+        <w:t xml:space="preserve"> rồi quét QR bằng Expo Go. Backend phải cho phép origin http://localhost:8082 (đã có trong cấu hình local); khi build APK hoặc deploy Vercel, origin của bản deploy phải được thêm vào biến BIHOME_CORS_ALLOWED_ORIGINS khi chạy backend.</w:t>
       </w:r>
     </w:p>
     <w:p>

</xml_diff>